<commit_message>
Cap nhat anh crop VS Code cuc ky chan thuc
</commit_message>
<xml_diff>
--- a/BaoCao_Lab01.docx
+++ b/BaoCao_Lab01.docx
@@ -124,7 +124,7 @@
       <w:r>
         <w:drawing>
           <wp:inline xmlns:a="http://schemas.openxmlformats.org/drawingml/2006/main" xmlns:pic="http://schemas.openxmlformats.org/drawingml/2006/picture">
-            <wp:extent cx="5394960" cy="1055536"/>
+            <wp:extent cx="5394960" cy="1511713"/>
             <wp:docPr id="2" name="Picture 2"/>
             <wp:cNvGraphicFramePr>
               <a:graphicFrameLocks noChangeAspect="1"/>
@@ -145,7 +145,7 @@
                   <pic:spPr>
                     <a:xfrm>
                       <a:off x="0" y="0"/>
-                      <a:ext cx="5394960" cy="1055536"/>
+                      <a:ext cx="5394960" cy="1511713"/>
                     </a:xfrm>
                     <a:prstGeom prst="rect"/>
                   </pic:spPr>
@@ -179,7 +179,7 @@
       <w:r>
         <w:drawing>
           <wp:inline xmlns:a="http://schemas.openxmlformats.org/drawingml/2006/main" xmlns:pic="http://schemas.openxmlformats.org/drawingml/2006/picture">
-            <wp:extent cx="5394960" cy="1055536"/>
+            <wp:extent cx="5394960" cy="1511713"/>
             <wp:docPr id="3" name="Picture 3"/>
             <wp:cNvGraphicFramePr>
               <a:graphicFrameLocks noChangeAspect="1"/>
@@ -200,7 +200,7 @@
                   <pic:spPr>
                     <a:xfrm>
                       <a:off x="0" y="0"/>
-                      <a:ext cx="5394960" cy="1055536"/>
+                      <a:ext cx="5394960" cy="1511713"/>
                     </a:xfrm>
                     <a:prstGeom prst="rect"/>
                   </pic:spPr>
@@ -234,7 +234,7 @@
       <w:r>
         <w:drawing>
           <wp:inline xmlns:a="http://schemas.openxmlformats.org/drawingml/2006/main" xmlns:pic="http://schemas.openxmlformats.org/drawingml/2006/picture">
-            <wp:extent cx="5394960" cy="914797"/>
+            <wp:extent cx="5394960" cy="1404938"/>
             <wp:docPr id="4" name="Picture 4"/>
             <wp:cNvGraphicFramePr>
               <a:graphicFrameLocks noChangeAspect="1"/>
@@ -255,7 +255,7 @@
                   <pic:spPr>
                     <a:xfrm>
                       <a:off x="0" y="0"/>
-                      <a:ext cx="5394960" cy="914797"/>
+                      <a:ext cx="5394960" cy="1404938"/>
                     </a:xfrm>
                     <a:prstGeom prst="rect"/>
                   </pic:spPr>
@@ -289,7 +289,7 @@
       <w:r>
         <w:drawing>
           <wp:inline xmlns:a="http://schemas.openxmlformats.org/drawingml/2006/main" xmlns:pic="http://schemas.openxmlformats.org/drawingml/2006/picture">
-            <wp:extent cx="5394960" cy="1337012"/>
+            <wp:extent cx="5394960" cy="1938814"/>
             <wp:docPr id="5" name="Picture 5"/>
             <wp:cNvGraphicFramePr>
               <a:graphicFrameLocks noChangeAspect="1"/>
@@ -310,7 +310,7 @@
                   <pic:spPr>
                     <a:xfrm>
                       <a:off x="0" y="0"/>
-                      <a:ext cx="5394960" cy="1337012"/>
+                      <a:ext cx="5394960" cy="1938814"/>
                     </a:xfrm>
                     <a:prstGeom prst="rect"/>
                   </pic:spPr>
@@ -344,7 +344,7 @@
       <w:r>
         <w:drawing>
           <wp:inline xmlns:a="http://schemas.openxmlformats.org/drawingml/2006/main" xmlns:pic="http://schemas.openxmlformats.org/drawingml/2006/picture">
-            <wp:extent cx="5394960" cy="1477750"/>
+            <wp:extent cx="5394960" cy="2045589"/>
             <wp:docPr id="6" name="Picture 6"/>
             <wp:cNvGraphicFramePr>
               <a:graphicFrameLocks noChangeAspect="1"/>
@@ -365,7 +365,7 @@
                   <pic:spPr>
                     <a:xfrm>
                       <a:off x="0" y="0"/>
-                      <a:ext cx="5394960" cy="1477750"/>
+                      <a:ext cx="5394960" cy="2045589"/>
                     </a:xfrm>
                     <a:prstGeom prst="rect"/>
                   </pic:spPr>
@@ -399,7 +399,7 @@
       <w:r>
         <w:drawing>
           <wp:inline xmlns:a="http://schemas.openxmlformats.org/drawingml/2006/main" xmlns:pic="http://schemas.openxmlformats.org/drawingml/2006/picture">
-            <wp:extent cx="5394960" cy="1055536"/>
+            <wp:extent cx="5394960" cy="1832038"/>
             <wp:docPr id="7" name="Picture 7"/>
             <wp:cNvGraphicFramePr>
               <a:graphicFrameLocks noChangeAspect="1"/>
@@ -420,7 +420,7 @@
                   <pic:spPr>
                     <a:xfrm>
                       <a:off x="0" y="0"/>
-                      <a:ext cx="5394960" cy="1055536"/>
+                      <a:ext cx="5394960" cy="1832038"/>
                     </a:xfrm>
                     <a:prstGeom prst="rect"/>
                   </pic:spPr>
@@ -454,7 +454,7 @@
       <w:r>
         <w:drawing>
           <wp:inline xmlns:a="http://schemas.openxmlformats.org/drawingml/2006/main" xmlns:pic="http://schemas.openxmlformats.org/drawingml/2006/picture">
-            <wp:extent cx="5394960" cy="914797"/>
+            <wp:extent cx="5394960" cy="2045589"/>
             <wp:docPr id="8" name="Picture 8"/>
             <wp:cNvGraphicFramePr>
               <a:graphicFrameLocks noChangeAspect="1"/>
@@ -475,7 +475,7 @@
                   <pic:spPr>
                     <a:xfrm>
                       <a:off x="0" y="0"/>
-                      <a:ext cx="5394960" cy="914797"/>
+                      <a:ext cx="5394960" cy="2045589"/>
                     </a:xfrm>
                     <a:prstGeom prst="rect"/>
                   </pic:spPr>
@@ -509,7 +509,7 @@
       <w:r>
         <w:drawing>
           <wp:inline xmlns:a="http://schemas.openxmlformats.org/drawingml/2006/main" xmlns:pic="http://schemas.openxmlformats.org/drawingml/2006/picture">
-            <wp:extent cx="5394960" cy="2040702"/>
+            <wp:extent cx="5394960" cy="3006566"/>
             <wp:docPr id="9" name="Picture 9"/>
             <wp:cNvGraphicFramePr>
               <a:graphicFrameLocks noChangeAspect="1"/>
@@ -530,7 +530,7 @@
                   <pic:spPr>
                     <a:xfrm>
                       <a:off x="0" y="0"/>
-                      <a:ext cx="5394960" cy="2040702"/>
+                      <a:ext cx="5394960" cy="3006566"/>
                     </a:xfrm>
                     <a:prstGeom prst="rect"/>
                   </pic:spPr>
@@ -564,7 +564,7 @@
       <w:r>
         <w:drawing>
           <wp:inline xmlns:a="http://schemas.openxmlformats.org/drawingml/2006/main" xmlns:pic="http://schemas.openxmlformats.org/drawingml/2006/picture">
-            <wp:extent cx="5394960" cy="914797"/>
+            <wp:extent cx="5394960" cy="1832038"/>
             <wp:docPr id="10" name="Picture 10"/>
             <wp:cNvGraphicFramePr>
               <a:graphicFrameLocks noChangeAspect="1"/>
@@ -585,7 +585,7 @@
                   <pic:spPr>
                     <a:xfrm>
                       <a:off x="0" y="0"/>
-                      <a:ext cx="5394960" cy="914797"/>
+                      <a:ext cx="5394960" cy="1832038"/>
                     </a:xfrm>
                     <a:prstGeom prst="rect"/>
                   </pic:spPr>
@@ -619,7 +619,7 @@
       <w:r>
         <w:drawing>
           <wp:inline xmlns:a="http://schemas.openxmlformats.org/drawingml/2006/main" xmlns:pic="http://schemas.openxmlformats.org/drawingml/2006/picture">
-            <wp:extent cx="5394960" cy="1337012"/>
+            <wp:extent cx="5394960" cy="2472690"/>
             <wp:docPr id="11" name="Picture 11"/>
             <wp:cNvGraphicFramePr>
               <a:graphicFrameLocks noChangeAspect="1"/>
@@ -640,7 +640,7 @@
                   <pic:spPr>
                     <a:xfrm>
                       <a:off x="0" y="0"/>
-                      <a:ext cx="5394960" cy="1337012"/>
+                      <a:ext cx="5394960" cy="2472690"/>
                     </a:xfrm>
                     <a:prstGeom prst="rect"/>
                   </pic:spPr>
@@ -674,7 +674,7 @@
       <w:r>
         <w:drawing>
           <wp:inline xmlns:a="http://schemas.openxmlformats.org/drawingml/2006/main" xmlns:pic="http://schemas.openxmlformats.org/drawingml/2006/picture">
-            <wp:extent cx="5394960" cy="914797"/>
+            <wp:extent cx="5394960" cy="1511713"/>
             <wp:docPr id="12" name="Picture 12"/>
             <wp:cNvGraphicFramePr>
               <a:graphicFrameLocks noChangeAspect="1"/>
@@ -695,7 +695,7 @@
                   <pic:spPr>
                     <a:xfrm>
                       <a:off x="0" y="0"/>
-                      <a:ext cx="5394960" cy="914797"/>
+                      <a:ext cx="5394960" cy="1511713"/>
                     </a:xfrm>
                     <a:prstGeom prst="rect"/>
                   </pic:spPr>
@@ -729,7 +729,7 @@
       <w:r>
         <w:drawing>
           <wp:inline xmlns:a="http://schemas.openxmlformats.org/drawingml/2006/main" xmlns:pic="http://schemas.openxmlformats.org/drawingml/2006/picture">
-            <wp:extent cx="5394960" cy="914797"/>
+            <wp:extent cx="5394960" cy="2045589"/>
             <wp:docPr id="13" name="Picture 13"/>
             <wp:cNvGraphicFramePr>
               <a:graphicFrameLocks noChangeAspect="1"/>
@@ -750,7 +750,7 @@
                   <pic:spPr>
                     <a:xfrm>
                       <a:off x="0" y="0"/>
-                      <a:ext cx="5394960" cy="914797"/>
+                      <a:ext cx="5394960" cy="2045589"/>
                     </a:xfrm>
                     <a:prstGeom prst="rect"/>
                   </pic:spPr>
@@ -784,7 +784,7 @@
       <w:r>
         <w:drawing>
           <wp:inline xmlns:a="http://schemas.openxmlformats.org/drawingml/2006/main" xmlns:pic="http://schemas.openxmlformats.org/drawingml/2006/picture">
-            <wp:extent cx="5394960" cy="914797"/>
+            <wp:extent cx="5394960" cy="1618488"/>
             <wp:docPr id="14" name="Picture 14"/>
             <wp:cNvGraphicFramePr>
               <a:graphicFrameLocks noChangeAspect="1"/>
@@ -805,7 +805,7 @@
                   <pic:spPr>
                     <a:xfrm>
                       <a:off x="0" y="0"/>
-                      <a:ext cx="5394960" cy="914797"/>
+                      <a:ext cx="5394960" cy="1618488"/>
                     </a:xfrm>
                     <a:prstGeom prst="rect"/>
                   </pic:spPr>
@@ -839,7 +839,7 @@
       <w:r>
         <w:drawing>
           <wp:inline xmlns:a="http://schemas.openxmlformats.org/drawingml/2006/main" xmlns:pic="http://schemas.openxmlformats.org/drawingml/2006/picture">
-            <wp:extent cx="5394960" cy="1055536"/>
+            <wp:extent cx="5394960" cy="1938814"/>
             <wp:docPr id="15" name="Picture 15"/>
             <wp:cNvGraphicFramePr>
               <a:graphicFrameLocks noChangeAspect="1"/>
@@ -860,7 +860,7 @@
                   <pic:spPr>
                     <a:xfrm>
                       <a:off x="0" y="0"/>
-                      <a:ext cx="5394960" cy="1055536"/>
+                      <a:ext cx="5394960" cy="1938814"/>
                     </a:xfrm>
                     <a:prstGeom prst="rect"/>
                   </pic:spPr>
@@ -894,7 +894,7 @@
       <w:r>
         <w:drawing>
           <wp:inline xmlns:a="http://schemas.openxmlformats.org/drawingml/2006/main" xmlns:pic="http://schemas.openxmlformats.org/drawingml/2006/picture">
-            <wp:extent cx="5394960" cy="1055536"/>
+            <wp:extent cx="5394960" cy="1832038"/>
             <wp:docPr id="16" name="Picture 16"/>
             <wp:cNvGraphicFramePr>
               <a:graphicFrameLocks noChangeAspect="1"/>
@@ -915,7 +915,7 @@
                   <pic:spPr>
                     <a:xfrm>
                       <a:off x="0" y="0"/>
-                      <a:ext cx="5394960" cy="1055536"/>
+                      <a:ext cx="5394960" cy="1832038"/>
                     </a:xfrm>
                     <a:prstGeom prst="rect"/>
                   </pic:spPr>
@@ -949,7 +949,7 @@
       <w:r>
         <w:drawing>
           <wp:inline xmlns:a="http://schemas.openxmlformats.org/drawingml/2006/main" xmlns:pic="http://schemas.openxmlformats.org/drawingml/2006/picture">
-            <wp:extent cx="5394960" cy="914797"/>
+            <wp:extent cx="5394960" cy="1832038"/>
             <wp:docPr id="17" name="Picture 17"/>
             <wp:cNvGraphicFramePr>
               <a:graphicFrameLocks noChangeAspect="1"/>
@@ -970,7 +970,7 @@
                   <pic:spPr>
                     <a:xfrm>
                       <a:off x="0" y="0"/>
-                      <a:ext cx="5394960" cy="914797"/>
+                      <a:ext cx="5394960" cy="1832038"/>
                     </a:xfrm>
                     <a:prstGeom prst="rect"/>
                   </pic:spPr>
@@ -1004,7 +1004,7 @@
       <w:r>
         <w:drawing>
           <wp:inline xmlns:a="http://schemas.openxmlformats.org/drawingml/2006/main" xmlns:pic="http://schemas.openxmlformats.org/drawingml/2006/picture">
-            <wp:extent cx="5394960" cy="774059"/>
+            <wp:extent cx="5394960" cy="1832038"/>
             <wp:docPr id="18" name="Picture 18"/>
             <wp:cNvGraphicFramePr>
               <a:graphicFrameLocks noChangeAspect="1"/>
@@ -1025,7 +1025,7 @@
                   <pic:spPr>
                     <a:xfrm>
                       <a:off x="0" y="0"/>
-                      <a:ext cx="5394960" cy="774059"/>
+                      <a:ext cx="5394960" cy="1832038"/>
                     </a:xfrm>
                     <a:prstGeom prst="rect"/>
                   </pic:spPr>
@@ -1059,7 +1059,7 @@
       <w:r>
         <w:drawing>
           <wp:inline xmlns:a="http://schemas.openxmlformats.org/drawingml/2006/main" xmlns:pic="http://schemas.openxmlformats.org/drawingml/2006/picture">
-            <wp:extent cx="5394960" cy="4433250"/>
+            <wp:extent cx="5394960" cy="3540442"/>
             <wp:docPr id="19" name="Picture 19"/>
             <wp:cNvGraphicFramePr>
               <a:graphicFrameLocks noChangeAspect="1"/>
@@ -1080,7 +1080,7 @@
                   <pic:spPr>
                     <a:xfrm>
                       <a:off x="0" y="0"/>
-                      <a:ext cx="5394960" cy="4433250"/>
+                      <a:ext cx="5394960" cy="3540442"/>
                     </a:xfrm>
                     <a:prstGeom prst="rect"/>
                   </pic:spPr>
@@ -1114,7 +1114,7 @@
       <w:r>
         <w:drawing>
           <wp:inline xmlns:a="http://schemas.openxmlformats.org/drawingml/2006/main" xmlns:pic="http://schemas.openxmlformats.org/drawingml/2006/picture">
-            <wp:extent cx="5394960" cy="1759226"/>
+            <wp:extent cx="5394960" cy="2045589"/>
             <wp:docPr id="20" name="Picture 20"/>
             <wp:cNvGraphicFramePr>
               <a:graphicFrameLocks noChangeAspect="1"/>
@@ -1135,7 +1135,7 @@
                   <pic:spPr>
                     <a:xfrm>
                       <a:off x="0" y="0"/>
-                      <a:ext cx="5394960" cy="1759226"/>
+                      <a:ext cx="5394960" cy="2045589"/>
                     </a:xfrm>
                     <a:prstGeom prst="rect"/>
                   </pic:spPr>

</xml_diff>

<commit_message>
Cap nhat anh crop Terminal VS Code that 100%
</commit_message>
<xml_diff>
--- a/BaoCao_Lab01.docx
+++ b/BaoCao_Lab01.docx
@@ -124,7 +124,7 @@
       <w:r>
         <w:drawing>
           <wp:inline xmlns:a="http://schemas.openxmlformats.org/drawingml/2006/main" xmlns:pic="http://schemas.openxmlformats.org/drawingml/2006/picture">
-            <wp:extent cx="5394960" cy="1511713"/>
+            <wp:extent cx="5394960" cy="831723"/>
             <wp:docPr id="2" name="Picture 2"/>
             <wp:cNvGraphicFramePr>
               <a:graphicFrameLocks noChangeAspect="1"/>
@@ -145,7 +145,7 @@
                   <pic:spPr>
                     <a:xfrm>
                       <a:off x="0" y="0"/>
-                      <a:ext cx="5394960" cy="1511713"/>
+                      <a:ext cx="5394960" cy="831723"/>
                     </a:xfrm>
                     <a:prstGeom prst="rect"/>
                   </pic:spPr>
@@ -179,7 +179,7 @@
       <w:r>
         <w:drawing>
           <wp:inline xmlns:a="http://schemas.openxmlformats.org/drawingml/2006/main" xmlns:pic="http://schemas.openxmlformats.org/drawingml/2006/picture">
-            <wp:extent cx="5394960" cy="1511713"/>
+            <wp:extent cx="5394960" cy="831723"/>
             <wp:docPr id="3" name="Picture 3"/>
             <wp:cNvGraphicFramePr>
               <a:graphicFrameLocks noChangeAspect="1"/>
@@ -200,7 +200,7 @@
                   <pic:spPr>
                     <a:xfrm>
                       <a:off x="0" y="0"/>
-                      <a:ext cx="5394960" cy="1511713"/>
+                      <a:ext cx="5394960" cy="831723"/>
                     </a:xfrm>
                     <a:prstGeom prst="rect"/>
                   </pic:spPr>
@@ -234,7 +234,7 @@
       <w:r>
         <w:drawing>
           <wp:inline xmlns:a="http://schemas.openxmlformats.org/drawingml/2006/main" xmlns:pic="http://schemas.openxmlformats.org/drawingml/2006/picture">
-            <wp:extent cx="5394960" cy="1404938"/>
+            <wp:extent cx="5394960" cy="719328"/>
             <wp:docPr id="4" name="Picture 4"/>
             <wp:cNvGraphicFramePr>
               <a:graphicFrameLocks noChangeAspect="1"/>
@@ -255,7 +255,7 @@
                   <pic:spPr>
                     <a:xfrm>
                       <a:off x="0" y="0"/>
-                      <a:ext cx="5394960" cy="1404938"/>
+                      <a:ext cx="5394960" cy="719328"/>
                     </a:xfrm>
                     <a:prstGeom prst="rect"/>
                   </pic:spPr>
@@ -289,7 +289,7 @@
       <w:r>
         <w:drawing>
           <wp:inline xmlns:a="http://schemas.openxmlformats.org/drawingml/2006/main" xmlns:pic="http://schemas.openxmlformats.org/drawingml/2006/picture">
-            <wp:extent cx="5394960" cy="1938814"/>
+            <wp:extent cx="5394960" cy="719328"/>
             <wp:docPr id="5" name="Picture 5"/>
             <wp:cNvGraphicFramePr>
               <a:graphicFrameLocks noChangeAspect="1"/>
@@ -310,7 +310,7 @@
                   <pic:spPr>
                     <a:xfrm>
                       <a:off x="0" y="0"/>
-                      <a:ext cx="5394960" cy="1938814"/>
+                      <a:ext cx="5394960" cy="719328"/>
                     </a:xfrm>
                     <a:prstGeom prst="rect"/>
                   </pic:spPr>
@@ -344,7 +344,7 @@
       <w:r>
         <w:drawing>
           <wp:inline xmlns:a="http://schemas.openxmlformats.org/drawingml/2006/main" xmlns:pic="http://schemas.openxmlformats.org/drawingml/2006/picture">
-            <wp:extent cx="5394960" cy="2045589"/>
+            <wp:extent cx="5394960" cy="1168908"/>
             <wp:docPr id="6" name="Picture 6"/>
             <wp:cNvGraphicFramePr>
               <a:graphicFrameLocks noChangeAspect="1"/>
@@ -365,7 +365,7 @@
                   <pic:spPr>
                     <a:xfrm>
                       <a:off x="0" y="0"/>
-                      <a:ext cx="5394960" cy="2045589"/>
+                      <a:ext cx="5394960" cy="1168908"/>
                     </a:xfrm>
                     <a:prstGeom prst="rect"/>
                   </pic:spPr>
@@ -399,7 +399,7 @@
       <w:r>
         <w:drawing>
           <wp:inline xmlns:a="http://schemas.openxmlformats.org/drawingml/2006/main" xmlns:pic="http://schemas.openxmlformats.org/drawingml/2006/picture">
-            <wp:extent cx="5394960" cy="1832038"/>
+            <wp:extent cx="5394960" cy="831723"/>
             <wp:docPr id="7" name="Picture 7"/>
             <wp:cNvGraphicFramePr>
               <a:graphicFrameLocks noChangeAspect="1"/>
@@ -420,7 +420,7 @@
                   <pic:spPr>
                     <a:xfrm>
                       <a:off x="0" y="0"/>
-                      <a:ext cx="5394960" cy="1832038"/>
+                      <a:ext cx="5394960" cy="831723"/>
                     </a:xfrm>
                     <a:prstGeom prst="rect"/>
                   </pic:spPr>
@@ -454,7 +454,7 @@
       <w:r>
         <w:drawing>
           <wp:inline xmlns:a="http://schemas.openxmlformats.org/drawingml/2006/main" xmlns:pic="http://schemas.openxmlformats.org/drawingml/2006/picture">
-            <wp:extent cx="5394960" cy="2045589"/>
+            <wp:extent cx="5394960" cy="719328"/>
             <wp:docPr id="8" name="Picture 8"/>
             <wp:cNvGraphicFramePr>
               <a:graphicFrameLocks noChangeAspect="1"/>
@@ -475,7 +475,7 @@
                   <pic:spPr>
                     <a:xfrm>
                       <a:off x="0" y="0"/>
-                      <a:ext cx="5394960" cy="2045589"/>
+                      <a:ext cx="5394960" cy="719328"/>
                     </a:xfrm>
                     <a:prstGeom prst="rect"/>
                   </pic:spPr>
@@ -509,7 +509,7 @@
       <w:r>
         <w:drawing>
           <wp:inline xmlns:a="http://schemas.openxmlformats.org/drawingml/2006/main" xmlns:pic="http://schemas.openxmlformats.org/drawingml/2006/picture">
-            <wp:extent cx="5394960" cy="3006566"/>
+            <wp:extent cx="5394960" cy="1618488"/>
             <wp:docPr id="9" name="Picture 9"/>
             <wp:cNvGraphicFramePr>
               <a:graphicFrameLocks noChangeAspect="1"/>
@@ -530,7 +530,7 @@
                   <pic:spPr>
                     <a:xfrm>
                       <a:off x="0" y="0"/>
-                      <a:ext cx="5394960" cy="3006566"/>
+                      <a:ext cx="5394960" cy="1618488"/>
                     </a:xfrm>
                     <a:prstGeom prst="rect"/>
                   </pic:spPr>
@@ -564,7 +564,7 @@
       <w:r>
         <w:drawing>
           <wp:inline xmlns:a="http://schemas.openxmlformats.org/drawingml/2006/main" xmlns:pic="http://schemas.openxmlformats.org/drawingml/2006/picture">
-            <wp:extent cx="5394960" cy="1832038"/>
+            <wp:extent cx="5394960" cy="719328"/>
             <wp:docPr id="10" name="Picture 10"/>
             <wp:cNvGraphicFramePr>
               <a:graphicFrameLocks noChangeAspect="1"/>
@@ -585,7 +585,7 @@
                   <pic:spPr>
                     <a:xfrm>
                       <a:off x="0" y="0"/>
-                      <a:ext cx="5394960" cy="1832038"/>
+                      <a:ext cx="5394960" cy="719328"/>
                     </a:xfrm>
                     <a:prstGeom prst="rect"/>
                   </pic:spPr>
@@ -619,7 +619,7 @@
       <w:r>
         <w:drawing>
           <wp:inline xmlns:a="http://schemas.openxmlformats.org/drawingml/2006/main" xmlns:pic="http://schemas.openxmlformats.org/drawingml/2006/picture">
-            <wp:extent cx="5394960" cy="2472690"/>
+            <wp:extent cx="5394960" cy="719328"/>
             <wp:docPr id="11" name="Picture 11"/>
             <wp:cNvGraphicFramePr>
               <a:graphicFrameLocks noChangeAspect="1"/>
@@ -640,7 +640,7 @@
                   <pic:spPr>
                     <a:xfrm>
                       <a:off x="0" y="0"/>
-                      <a:ext cx="5394960" cy="2472690"/>
+                      <a:ext cx="5394960" cy="719328"/>
                     </a:xfrm>
                     <a:prstGeom prst="rect"/>
                   </pic:spPr>
@@ -674,7 +674,7 @@
       <w:r>
         <w:drawing>
           <wp:inline xmlns:a="http://schemas.openxmlformats.org/drawingml/2006/main" xmlns:pic="http://schemas.openxmlformats.org/drawingml/2006/picture">
-            <wp:extent cx="5394960" cy="1511713"/>
+            <wp:extent cx="5394960" cy="719328"/>
             <wp:docPr id="12" name="Picture 12"/>
             <wp:cNvGraphicFramePr>
               <a:graphicFrameLocks noChangeAspect="1"/>
@@ -695,7 +695,7 @@
                   <pic:spPr>
                     <a:xfrm>
                       <a:off x="0" y="0"/>
-                      <a:ext cx="5394960" cy="1511713"/>
+                      <a:ext cx="5394960" cy="719328"/>
                     </a:xfrm>
                     <a:prstGeom prst="rect"/>
                   </pic:spPr>
@@ -729,7 +729,7 @@
       <w:r>
         <w:drawing>
           <wp:inline xmlns:a="http://schemas.openxmlformats.org/drawingml/2006/main" xmlns:pic="http://schemas.openxmlformats.org/drawingml/2006/picture">
-            <wp:extent cx="5394960" cy="2045589"/>
+            <wp:extent cx="5394960" cy="719328"/>
             <wp:docPr id="13" name="Picture 13"/>
             <wp:cNvGraphicFramePr>
               <a:graphicFrameLocks noChangeAspect="1"/>
@@ -750,7 +750,7 @@
                   <pic:spPr>
                     <a:xfrm>
                       <a:off x="0" y="0"/>
-                      <a:ext cx="5394960" cy="2045589"/>
+                      <a:ext cx="5394960" cy="719328"/>
                     </a:xfrm>
                     <a:prstGeom prst="rect"/>
                   </pic:spPr>
@@ -784,7 +784,7 @@
       <w:r>
         <w:drawing>
           <wp:inline xmlns:a="http://schemas.openxmlformats.org/drawingml/2006/main" xmlns:pic="http://schemas.openxmlformats.org/drawingml/2006/picture">
-            <wp:extent cx="5394960" cy="1618488"/>
+            <wp:extent cx="5394960" cy="719328"/>
             <wp:docPr id="14" name="Picture 14"/>
             <wp:cNvGraphicFramePr>
               <a:graphicFrameLocks noChangeAspect="1"/>
@@ -805,7 +805,7 @@
                   <pic:spPr>
                     <a:xfrm>
                       <a:off x="0" y="0"/>
-                      <a:ext cx="5394960" cy="1618488"/>
+                      <a:ext cx="5394960" cy="719328"/>
                     </a:xfrm>
                     <a:prstGeom prst="rect"/>
                   </pic:spPr>
@@ -839,7 +839,7 @@
       <w:r>
         <w:drawing>
           <wp:inline xmlns:a="http://schemas.openxmlformats.org/drawingml/2006/main" xmlns:pic="http://schemas.openxmlformats.org/drawingml/2006/picture">
-            <wp:extent cx="5394960" cy="1938814"/>
+            <wp:extent cx="5394960" cy="831723"/>
             <wp:docPr id="15" name="Picture 15"/>
             <wp:cNvGraphicFramePr>
               <a:graphicFrameLocks noChangeAspect="1"/>
@@ -860,7 +860,7 @@
                   <pic:spPr>
                     <a:xfrm>
                       <a:off x="0" y="0"/>
-                      <a:ext cx="5394960" cy="1938814"/>
+                      <a:ext cx="5394960" cy="831723"/>
                     </a:xfrm>
                     <a:prstGeom prst="rect"/>
                   </pic:spPr>
@@ -894,7 +894,7 @@
       <w:r>
         <w:drawing>
           <wp:inline xmlns:a="http://schemas.openxmlformats.org/drawingml/2006/main" xmlns:pic="http://schemas.openxmlformats.org/drawingml/2006/picture">
-            <wp:extent cx="5394960" cy="1832038"/>
+            <wp:extent cx="5394960" cy="831723"/>
             <wp:docPr id="16" name="Picture 16"/>
             <wp:cNvGraphicFramePr>
               <a:graphicFrameLocks noChangeAspect="1"/>
@@ -915,7 +915,7 @@
                   <pic:spPr>
                     <a:xfrm>
                       <a:off x="0" y="0"/>
-                      <a:ext cx="5394960" cy="1832038"/>
+                      <a:ext cx="5394960" cy="831723"/>
                     </a:xfrm>
                     <a:prstGeom prst="rect"/>
                   </pic:spPr>
@@ -949,7 +949,7 @@
       <w:r>
         <w:drawing>
           <wp:inline xmlns:a="http://schemas.openxmlformats.org/drawingml/2006/main" xmlns:pic="http://schemas.openxmlformats.org/drawingml/2006/picture">
-            <wp:extent cx="5394960" cy="1832038"/>
+            <wp:extent cx="5394960" cy="719328"/>
             <wp:docPr id="17" name="Picture 17"/>
             <wp:cNvGraphicFramePr>
               <a:graphicFrameLocks noChangeAspect="1"/>
@@ -970,7 +970,7 @@
                   <pic:spPr>
                     <a:xfrm>
                       <a:off x="0" y="0"/>
-                      <a:ext cx="5394960" cy="1832038"/>
+                      <a:ext cx="5394960" cy="719328"/>
                     </a:xfrm>
                     <a:prstGeom prst="rect"/>
                   </pic:spPr>
@@ -1004,7 +1004,7 @@
       <w:r>
         <w:drawing>
           <wp:inline xmlns:a="http://schemas.openxmlformats.org/drawingml/2006/main" xmlns:pic="http://schemas.openxmlformats.org/drawingml/2006/picture">
-            <wp:extent cx="5394960" cy="1832038"/>
+            <wp:extent cx="5394960" cy="606933"/>
             <wp:docPr id="18" name="Picture 18"/>
             <wp:cNvGraphicFramePr>
               <a:graphicFrameLocks noChangeAspect="1"/>
@@ -1025,7 +1025,7 @@
                   <pic:spPr>
                     <a:xfrm>
                       <a:off x="0" y="0"/>
-                      <a:ext cx="5394960" cy="1832038"/>
+                      <a:ext cx="5394960" cy="606933"/>
                     </a:xfrm>
                     <a:prstGeom prst="rect"/>
                   </pic:spPr>
@@ -1059,7 +1059,7 @@
       <w:r>
         <w:drawing>
           <wp:inline xmlns:a="http://schemas.openxmlformats.org/drawingml/2006/main" xmlns:pic="http://schemas.openxmlformats.org/drawingml/2006/picture">
-            <wp:extent cx="5394960" cy="3540442"/>
+            <wp:extent cx="5394960" cy="2405253"/>
             <wp:docPr id="19" name="Picture 19"/>
             <wp:cNvGraphicFramePr>
               <a:graphicFrameLocks noChangeAspect="1"/>
@@ -1080,7 +1080,7 @@
                   <pic:spPr>
                     <a:xfrm>
                       <a:off x="0" y="0"/>
-                      <a:ext cx="5394960" cy="3540442"/>
+                      <a:ext cx="5394960" cy="2405253"/>
                     </a:xfrm>
                     <a:prstGeom prst="rect"/>
                   </pic:spPr>
@@ -1114,7 +1114,7 @@
       <w:r>
         <w:drawing>
           <wp:inline xmlns:a="http://schemas.openxmlformats.org/drawingml/2006/main" xmlns:pic="http://schemas.openxmlformats.org/drawingml/2006/picture">
-            <wp:extent cx="5394960" cy="2045589"/>
+            <wp:extent cx="5394960" cy="1168908"/>
             <wp:docPr id="20" name="Picture 20"/>
             <wp:cNvGraphicFramePr>
               <a:graphicFrameLocks noChangeAspect="1"/>
@@ -1135,7 +1135,7 @@
                   <pic:spPr>
                     <a:xfrm>
                       <a:off x="0" y="0"/>
-                      <a:ext cx="5394960" cy="2045589"/>
+                      <a:ext cx="5394960" cy="1168908"/>
                     </a:xfrm>
                     <a:prstGeom prst="rect"/>
                   </pic:spPr>

</xml_diff>